<commit_message>
added attribution and source code link to flyer
</commit_message>
<xml_diff>
--- a/Building Blocks of Life_v2.docx
+++ b/Building Blocks of Life_v2.docx
@@ -1,6 +1,6 @@
 
 <file path=word/document.xml><?xml version="1.0" encoding="utf-8"?>
-<w:document xmlns:wpc="http://schemas.microsoft.com/office/word/2010/wordprocessingCanvas" xmlns:cx="http://schemas.microsoft.com/office/drawing/2014/chartex" xmlns:cx1="http://schemas.microsoft.com/office/drawing/2015/9/8/chartex" xmlns:cx2="http://schemas.microsoft.com/office/drawing/2015/10/21/chartex" xmlns:cx3="http://schemas.microsoft.com/office/drawing/2016/5/9/chartex" xmlns:cx4="http://schemas.microsoft.com/office/drawing/2016/5/10/chartex" xmlns:cx5="http://schemas.microsoft.com/office/drawing/2016/5/11/chartex" xmlns:cx6="http://schemas.microsoft.com/office/drawing/2016/5/12/chartex" xmlns:cx7="http://schemas.microsoft.com/office/drawing/2016/5/13/chartex" xmlns:cx8="http://schemas.microsoft.com/office/drawing/2016/5/14/chartex" xmlns:mc="http://schemas.openxmlformats.org/markup-compatibility/2006" xmlns:aink="http://schemas.microsoft.com/office/drawing/2016/ink" xmlns:am3d="http://schemas.microsoft.com/office/drawing/2017/model3d" xmlns:o="urn:schemas-microsoft-com:office:office" xmlns:oel="http://schemas.microsoft.com/office/2019/extlst" xmlns:r="http://schemas.openxmlformats.org/officeDocument/2006/relationships" xmlns:m="http://schemas.openxmlformats.org/officeDocument/2006/math" xmlns:v="urn:schemas-microsoft-com:vml" xmlns:wp14="http://schemas.microsoft.com/office/word/2010/wordprocessingDrawing" xmlns:wp="http://schemas.openxmlformats.org/drawingml/2006/wordprocessingDrawing" xmlns:w10="urn:schemas-microsoft-com:office:word" xmlns:w="http://schemas.openxmlformats.org/wordprocessingml/2006/main" xmlns:w14="http://schemas.microsoft.com/office/word/2010/wordml" xmlns:w15="http://schemas.microsoft.com/office/word/2012/wordml" xmlns:w16cex="http://schemas.microsoft.com/office/word/2018/wordml/cex" xmlns:w16cid="http://schemas.microsoft.com/office/word/2016/wordml/cid" xmlns:w16="http://schemas.microsoft.com/office/word/2018/wordml" xmlns:w16du="http://schemas.microsoft.com/office/word/2023/wordml/word16du" xmlns:w16sdtdh="http://schemas.microsoft.com/office/word/2020/wordml/sdtdatahash" xmlns:w16se="http://schemas.microsoft.com/office/word/2015/wordml/symex" xmlns:wpg="http://schemas.microsoft.com/office/word/2010/wordprocessingGroup" xmlns:wpi="http://schemas.microsoft.com/office/word/2010/wordprocessingInk" xmlns:wne="http://schemas.microsoft.com/office/word/2006/wordml" xmlns:wps="http://schemas.microsoft.com/office/word/2010/wordprocessingShape" mc:Ignorable="w14 w15 w16se w16cid w16 w16cex w16sdtdh w16du wp14">
+<w:document xmlns:wpc="http://schemas.microsoft.com/office/word/2010/wordprocessingCanvas" xmlns:cx="http://schemas.microsoft.com/office/drawing/2014/chartex" xmlns:cx1="http://schemas.microsoft.com/office/drawing/2015/9/8/chartex" xmlns:cx2="http://schemas.microsoft.com/office/drawing/2015/10/21/chartex" xmlns:cx3="http://schemas.microsoft.com/office/drawing/2016/5/9/chartex" xmlns:cx4="http://schemas.microsoft.com/office/drawing/2016/5/10/chartex" xmlns:cx5="http://schemas.microsoft.com/office/drawing/2016/5/11/chartex" xmlns:cx6="http://schemas.microsoft.com/office/drawing/2016/5/12/chartex" xmlns:cx7="http://schemas.microsoft.com/office/drawing/2016/5/13/chartex" xmlns:cx8="http://schemas.microsoft.com/office/drawing/2016/5/14/chartex" xmlns:mc="http://schemas.openxmlformats.org/markup-compatibility/2006" xmlns:aink="http://schemas.microsoft.com/office/drawing/2016/ink" xmlns:am3d="http://schemas.microsoft.com/office/drawing/2017/model3d" xmlns:o="urn:schemas-microsoft-com:office:office" xmlns:oel="http://schemas.microsoft.com/office/2019/extlst" xmlns:r="http://schemas.openxmlformats.org/officeDocument/2006/relationships" xmlns:m="http://schemas.openxmlformats.org/officeDocument/2006/math" xmlns:v="urn:schemas-microsoft-com:vml" xmlns:wp14="http://schemas.microsoft.com/office/word/2010/wordprocessingDrawing" xmlns:wp="http://schemas.openxmlformats.org/drawingml/2006/wordprocessingDrawing" xmlns:w10="urn:schemas-microsoft-com:office:word" xmlns:w="http://schemas.openxmlformats.org/wordprocessingml/2006/main" xmlns:w14="http://schemas.microsoft.com/office/word/2010/wordml" xmlns:w15="http://schemas.microsoft.com/office/word/2012/wordml" xmlns:w16cex="http://schemas.microsoft.com/office/word/2018/wordml/cex" xmlns:w16cid="http://schemas.microsoft.com/office/word/2016/wordml/cid" xmlns:w16="http://schemas.microsoft.com/office/word/2018/wordml" xmlns:w16du="http://schemas.microsoft.com/office/word/2023/wordml/word16du" xmlns:w16sdtdh="http://schemas.microsoft.com/office/word/2020/wordml/sdtdatahash" xmlns:w16sdtfl="http://schemas.microsoft.com/office/word/2024/wordml/sdtformatlock" xmlns:w16se="http://schemas.microsoft.com/office/word/2015/wordml/symex" xmlns:wpg="http://schemas.microsoft.com/office/word/2010/wordprocessingGroup" xmlns:wpi="http://schemas.microsoft.com/office/word/2010/wordprocessingInk" xmlns:wne="http://schemas.microsoft.com/office/word/2006/wordml" xmlns:wps="http://schemas.microsoft.com/office/word/2010/wordprocessingShape" mc:Ignorable="w14 w15 w16se w16cid w16 w16cex w16sdtdh w16sdtfl w16du wp14">
   <w:body>
     <w:p>
       <w:pPr>
@@ -351,33 +351,7 @@
           <w:szCs w:val="18"/>
           <w14:ligatures w14:val="none"/>
         </w:rPr>
-        <w:t xml:space="preserve">LECT2 (Leukocyte Cell-Derived </w:t>
-      </w:r>
-      <w:proofErr w:type="spellStart"/>
-      <w:r>
-        <w:rPr>
-          <w:rFonts w:ascii="Arial" w:eastAsia="Times New Roman" w:hAnsi="Arial" w:cs="Arial"/>
-          <w:b/>
-          <w:bCs/>
-          <w:kern w:val="0"/>
-          <w:sz w:val="18"/>
-          <w:szCs w:val="18"/>
-          <w14:ligatures w14:val="none"/>
-        </w:rPr>
-        <w:t>Chemotaxin</w:t>
-      </w:r>
-      <w:proofErr w:type="spellEnd"/>
-      <w:r>
-        <w:rPr>
-          <w:rFonts w:ascii="Arial" w:eastAsia="Times New Roman" w:hAnsi="Arial" w:cs="Arial"/>
-          <w:b/>
-          <w:bCs/>
-          <w:kern w:val="0"/>
-          <w:sz w:val="18"/>
-          <w:szCs w:val="18"/>
-          <w14:ligatures w14:val="none"/>
-        </w:rPr>
-        <w:t xml:space="preserve"> 2):</w:t>
+        <w:t>LECT2 (Leukocyte Cell-Derived Chemotaxin 2):</w:t>
       </w:r>
       <w:r>
         <w:rPr>
@@ -962,6 +936,34 @@
         <w:t>bioveiwer.net/flyer</w:t>
       </w:r>
     </w:p>
+    <w:p>
+      <w:pPr>
+        <w:rPr>
+          <w:rFonts w:ascii="Arial" w:eastAsia="Times New Roman" w:hAnsi="Arial" w:cs="Arial"/>
+          <w:kern w:val="0"/>
+          <w:sz w:val="18"/>
+          <w:szCs w:val="18"/>
+          <w14:ligatures w14:val="none"/>
+        </w:rPr>
+      </w:pPr>
+    </w:p>
+    <w:p>
+      <w:pPr>
+        <w:rPr>
+          <w:rFonts w:ascii="Arial" w:eastAsia="Times New Roman" w:hAnsi="Arial" w:cs="Arial"/>
+          <w:sz w:val="18"/>
+          <w:szCs w:val="18"/>
+        </w:rPr>
+      </w:pPr>
+      <w:r>
+        <w:rPr>
+          <w:rFonts w:ascii="Arial" w:eastAsia="Times New Roman" w:hAnsi="Arial" w:cs="Arial"/>
+          <w:sz w:val="18"/>
+          <w:szCs w:val="18"/>
+        </w:rPr>
+        <w:t>Made by Shervin Nia. Source code available at github.com/shervinnia</w:t>
+      </w:r>
+    </w:p>
     <w:sectPr>
       <w:pgSz w:w="12240" w:h="15840"/>
       <w:pgMar w:top="720" w:right="720" w:bottom="720" w:left="720" w:header="720" w:footer="720" w:gutter="0"/>
@@ -973,7 +975,7 @@
 </file>
 
 <file path=word/numbering.xml><?xml version="1.0" encoding="utf-8"?>
-<w:numbering xmlns:wpc="http://schemas.microsoft.com/office/word/2010/wordprocessingCanvas" xmlns:cx="http://schemas.microsoft.com/office/drawing/2014/chartex" xmlns:cx1="http://schemas.microsoft.com/office/drawing/2015/9/8/chartex" xmlns:cx2="http://schemas.microsoft.com/office/drawing/2015/10/21/chartex" xmlns:cx3="http://schemas.microsoft.com/office/drawing/2016/5/9/chartex" xmlns:cx4="http://schemas.microsoft.com/office/drawing/2016/5/10/chartex" xmlns:cx5="http://schemas.microsoft.com/office/drawing/2016/5/11/chartex" xmlns:cx6="http://schemas.microsoft.com/office/drawing/2016/5/12/chartex" xmlns:cx7="http://schemas.microsoft.com/office/drawing/2016/5/13/chartex" xmlns:cx8="http://schemas.microsoft.com/office/drawing/2016/5/14/chartex" xmlns:mc="http://schemas.openxmlformats.org/markup-compatibility/2006" xmlns:aink="http://schemas.microsoft.com/office/drawing/2016/ink" xmlns:am3d="http://schemas.microsoft.com/office/drawing/2017/model3d" xmlns:o="urn:schemas-microsoft-com:office:office" xmlns:oel="http://schemas.microsoft.com/office/2019/extlst" xmlns:r="http://schemas.openxmlformats.org/officeDocument/2006/relationships" xmlns:m="http://schemas.openxmlformats.org/officeDocument/2006/math" xmlns:v="urn:schemas-microsoft-com:vml" xmlns:wp14="http://schemas.microsoft.com/office/word/2010/wordprocessingDrawing" xmlns:wp="http://schemas.openxmlformats.org/drawingml/2006/wordprocessingDrawing" xmlns:w10="urn:schemas-microsoft-com:office:word" xmlns:w="http://schemas.openxmlformats.org/wordprocessingml/2006/main" xmlns:w14="http://schemas.microsoft.com/office/word/2010/wordml" xmlns:w15="http://schemas.microsoft.com/office/word/2012/wordml" xmlns:w16cex="http://schemas.microsoft.com/office/word/2018/wordml/cex" xmlns:w16cid="http://schemas.microsoft.com/office/word/2016/wordml/cid" xmlns:w16="http://schemas.microsoft.com/office/word/2018/wordml" xmlns:w16du="http://schemas.microsoft.com/office/word/2023/wordml/word16du" xmlns:w16sdtdh="http://schemas.microsoft.com/office/word/2020/wordml/sdtdatahash" xmlns:w16se="http://schemas.microsoft.com/office/word/2015/wordml/symex" xmlns:wpg="http://schemas.microsoft.com/office/word/2010/wordprocessingGroup" xmlns:wpi="http://schemas.microsoft.com/office/word/2010/wordprocessingInk" xmlns:wne="http://schemas.microsoft.com/office/word/2006/wordml" xmlns:wps="http://schemas.microsoft.com/office/word/2010/wordprocessingShape" mc:Ignorable="w14 w15 w16se w16cid w16 w16cex w16sdtdh w16du wp14">
+<w:numbering xmlns:wpc="http://schemas.microsoft.com/office/word/2010/wordprocessingCanvas" xmlns:cx="http://schemas.microsoft.com/office/drawing/2014/chartex" xmlns:cx1="http://schemas.microsoft.com/office/drawing/2015/9/8/chartex" xmlns:cx2="http://schemas.microsoft.com/office/drawing/2015/10/21/chartex" xmlns:cx3="http://schemas.microsoft.com/office/drawing/2016/5/9/chartex" xmlns:cx4="http://schemas.microsoft.com/office/drawing/2016/5/10/chartex" xmlns:cx5="http://schemas.microsoft.com/office/drawing/2016/5/11/chartex" xmlns:cx6="http://schemas.microsoft.com/office/drawing/2016/5/12/chartex" xmlns:cx7="http://schemas.microsoft.com/office/drawing/2016/5/13/chartex" xmlns:cx8="http://schemas.microsoft.com/office/drawing/2016/5/14/chartex" xmlns:mc="http://schemas.openxmlformats.org/markup-compatibility/2006" xmlns:aink="http://schemas.microsoft.com/office/drawing/2016/ink" xmlns:am3d="http://schemas.microsoft.com/office/drawing/2017/model3d" xmlns:o="urn:schemas-microsoft-com:office:office" xmlns:oel="http://schemas.microsoft.com/office/2019/extlst" xmlns:r="http://schemas.openxmlformats.org/officeDocument/2006/relationships" xmlns:m="http://schemas.openxmlformats.org/officeDocument/2006/math" xmlns:v="urn:schemas-microsoft-com:vml" xmlns:wp14="http://schemas.microsoft.com/office/word/2010/wordprocessingDrawing" xmlns:wp="http://schemas.openxmlformats.org/drawingml/2006/wordprocessingDrawing" xmlns:w10="urn:schemas-microsoft-com:office:word" xmlns:w="http://schemas.openxmlformats.org/wordprocessingml/2006/main" xmlns:w14="http://schemas.microsoft.com/office/word/2010/wordml" xmlns:w15="http://schemas.microsoft.com/office/word/2012/wordml" xmlns:w16cex="http://schemas.microsoft.com/office/word/2018/wordml/cex" xmlns:w16cid="http://schemas.microsoft.com/office/word/2016/wordml/cid" xmlns:w16="http://schemas.microsoft.com/office/word/2018/wordml" xmlns:w16du="http://schemas.microsoft.com/office/word/2023/wordml/word16du" xmlns:w16sdtdh="http://schemas.microsoft.com/office/word/2020/wordml/sdtdatahash" xmlns:w16sdtfl="http://schemas.microsoft.com/office/word/2024/wordml/sdtformatlock" xmlns:w16se="http://schemas.microsoft.com/office/word/2015/wordml/symex" xmlns:wpg="http://schemas.microsoft.com/office/word/2010/wordprocessingGroup" xmlns:wpi="http://schemas.microsoft.com/office/word/2010/wordprocessingInk" xmlns:wne="http://schemas.microsoft.com/office/word/2006/wordml" xmlns:wps="http://schemas.microsoft.com/office/word/2010/wordprocessingShape" mc:Ignorable="w14 w15 w16se w16cid w16 w16cex w16sdtdh w16sdtfl w16du wp14">
   <w:abstractNum w:abstractNumId="0" w15:restartNumberingAfterBreak="0">
     <w:nsid w:val="2A536A41"/>
     <w:multiLevelType w:val="multilevel"/>
@@ -1130,7 +1132,7 @@
 </file>
 
 <file path=word/styles.xml><?xml version="1.0" encoding="utf-8"?>
-<w:styles xmlns:mc="http://schemas.openxmlformats.org/markup-compatibility/2006" xmlns:r="http://schemas.openxmlformats.org/officeDocument/2006/relationships" xmlns:w="http://schemas.openxmlformats.org/wordprocessingml/2006/main" xmlns:w14="http://schemas.microsoft.com/office/word/2010/wordml" xmlns:w15="http://schemas.microsoft.com/office/word/2012/wordml" xmlns:w16cex="http://schemas.microsoft.com/office/word/2018/wordml/cex" xmlns:w16cid="http://schemas.microsoft.com/office/word/2016/wordml/cid" xmlns:w16="http://schemas.microsoft.com/office/word/2018/wordml" xmlns:w16du="http://schemas.microsoft.com/office/word/2023/wordml/word16du" xmlns:w16sdtdh="http://schemas.microsoft.com/office/word/2020/wordml/sdtdatahash" xmlns:w16se="http://schemas.microsoft.com/office/word/2015/wordml/symex" mc:Ignorable="w14 w15 w16se w16cid w16 w16cex w16sdtdh w16du">
+<w:styles xmlns:mc="http://schemas.openxmlformats.org/markup-compatibility/2006" xmlns:r="http://schemas.openxmlformats.org/officeDocument/2006/relationships" xmlns:w="http://schemas.openxmlformats.org/wordprocessingml/2006/main" xmlns:w14="http://schemas.microsoft.com/office/word/2010/wordml" xmlns:w15="http://schemas.microsoft.com/office/word/2012/wordml" xmlns:w16cex="http://schemas.microsoft.com/office/word/2018/wordml/cex" xmlns:w16cid="http://schemas.microsoft.com/office/word/2016/wordml/cid" xmlns:w16="http://schemas.microsoft.com/office/word/2018/wordml" xmlns:w16du="http://schemas.microsoft.com/office/word/2023/wordml/word16du" xmlns:w16sdtdh="http://schemas.microsoft.com/office/word/2020/wordml/sdtdatahash" xmlns:w16sdtfl="http://schemas.microsoft.com/office/word/2024/wordml/sdtformatlock" xmlns:w16se="http://schemas.microsoft.com/office/word/2015/wordml/symex" mc:Ignorable="w14 w15 w16se w16cid w16 w16cex w16sdtdh w16sdtfl w16du">
   <w:docDefaults>
     <w:rPrDefault>
       <w:rPr>

</xml_diff>